<commit_message>
Colour added to Edits
</commit_message>
<xml_diff>
--- a/Manuscript and House Style/Bonecas Russas Edits.docx
+++ b/Manuscript and House Style/Bonecas Russas Edits.docx
@@ -3,26 +3,45 @@
 <w:document xmlns:wpc="http://schemas.microsoft.com/office/word/2010/wordprocessingCanvas" xmlns:cx="http://schemas.microsoft.com/office/drawing/2014/chartex" xmlns:cx1="http://schemas.microsoft.com/office/drawing/2015/9/8/chartex" xmlns:cx2="http://schemas.microsoft.com/office/drawing/2015/10/21/chartex" xmlns:cx3="http://schemas.microsoft.com/office/drawing/2016/5/9/chartex" xmlns:cx4="http://schemas.microsoft.com/office/drawing/2016/5/10/chartex" xmlns:cx5="http://schemas.microsoft.com/office/drawing/2016/5/11/chartex" xmlns:cx6="http://schemas.microsoft.com/office/drawing/2016/5/12/chartex" xmlns:cx7="http://schemas.microsoft.com/office/drawing/2016/5/13/chartex" xmlns:cx8="http://schemas.microsoft.com/office/drawing/2016/5/14/chartex" xmlns:mc="http://schemas.openxmlformats.org/markup-compatibility/2006" xmlns:aink="http://schemas.microsoft.com/office/drawing/2016/ink" xmlns:am3d="http://schemas.microsoft.com/office/drawing/2017/model3d" xmlns:o="urn:schemas-microsoft-com:office:office" xmlns:oel="http://schemas.microsoft.com/office/2019/extlst" xmlns:r="http://schemas.openxmlformats.org/officeDocument/2006/relationships" xmlns:m="http://schemas.openxmlformats.org/officeDocument/2006/math" xmlns:v="urn:schemas-microsoft-com:vml" xmlns:wp14="http://schemas.microsoft.com/office/word/2010/wordprocessingDrawing" xmlns:wp="http://schemas.openxmlformats.org/drawingml/2006/wordprocessingDrawing" xmlns:w10="urn:schemas-microsoft-com:office:word" xmlns:w="http://schemas.openxmlformats.org/wordprocessingml/2006/main" xmlns:w14="http://schemas.microsoft.com/office/word/2010/wordml" xmlns:w15="http://schemas.microsoft.com/office/word/2012/wordml" xmlns:w16cex="http://schemas.microsoft.com/office/word/2018/wordml/cex" xmlns:w16cid="http://schemas.microsoft.com/office/word/2016/wordml/cid" xmlns:w16="http://schemas.microsoft.com/office/word/2018/wordml" xmlns:w16du="http://schemas.microsoft.com/office/word/2023/wordml/word16du" xmlns:w16sdtdh="http://schemas.microsoft.com/office/word/2020/wordml/sdtdatahash" xmlns:w16se="http://schemas.microsoft.com/office/word/2015/wordml/symex" xmlns:wpg="http://schemas.microsoft.com/office/word/2010/wordprocessingGroup" xmlns:wpi="http://schemas.microsoft.com/office/word/2010/wordprocessingInk" xmlns:wne="http://schemas.microsoft.com/office/word/2006/wordml" xmlns:wps="http://schemas.microsoft.com/office/word/2010/wordprocessingShape" mc:Ignorable="w14 w15 w16se w16cid w16 w16cex w16sdtdh w16du wp14">
   <w:body>
     <w:p>
-      <w:proofErr w:type="spellStart"/>
-      <w:r>
-        <w:t>Bonecas</w:t>
-      </w:r>
-      <w:proofErr w:type="spellEnd"/>
-      <w:r>
-        <w:t xml:space="preserve"> </w:t>
-      </w:r>
-      <w:proofErr w:type="spellStart"/>
-      <w:r>
-        <w:t>Russas</w:t>
-      </w:r>
-      <w:proofErr w:type="spellEnd"/>
-      <w:r>
-        <w:t xml:space="preserve"> Edits</w:t>
-      </w:r>
-    </w:p>
-    <w:p/>
-    <w:p/>
-    <w:p/>
+      <w:pPr>
+        <w:rPr>
+          <w:b/>
+          <w:bCs/>
+          <w:color w:val="0000FF"/>
+        </w:rPr>
+      </w:pPr>
+      <w:r>
+        <w:rPr>
+          <w:b/>
+          <w:bCs/>
+          <w:color w:val="0000FF"/>
+        </w:rPr>
+        <w:t xml:space="preserve">Bonecas Russas </w:t>
+      </w:r>
+      <w:r>
+        <w:rPr>
+          <w:b/>
+          <w:bCs/>
+          <w:color w:val="0000FF"/>
+        </w:rPr>
+        <w:t xml:space="preserve">Part 1 </w:t>
+      </w:r>
+      <w:r>
+        <w:rPr>
+          <w:b/>
+          <w:bCs/>
+          <w:color w:val="0000FF"/>
+        </w:rPr>
+        <w:t>Edits</w:t>
+      </w:r>
+    </w:p>
+    <w:p>
+      <w:pPr>
+        <w:rPr>
+          <w:color w:val="0000FF"/>
+        </w:rPr>
+      </w:pPr>
+    </w:p>
     <w:p>
       <w:pPr>
         <w:pStyle w:val="ListParagraph"/>
@@ -30,24 +49,48 @@
           <w:ilvl w:val="0"/>
           <w:numId w:val="2"/>
         </w:numPr>
-      </w:pPr>
-      <w:r>
-        <w:t xml:space="preserve">M6 -9, </w:t>
-      </w:r>
-      <w:proofErr w:type="spellStart"/>
-      <w:r>
-        <w:t>Bcl</w:t>
-      </w:r>
-      <w:proofErr w:type="spellEnd"/>
-      <w:r>
-        <w:t>: see edits to manuscript and update current version. They are 1) I added tons of dynamics; M9 I added triplet rest before fermata  and beat 1 dynamics.</w:t>
-      </w:r>
-    </w:p>
-    <w:p/>
-    <w:p>
+        <w:rPr>
+          <w:color w:val="0000FF"/>
+        </w:rPr>
+      </w:pPr>
+      <w:r>
+        <w:rPr>
+          <w:color w:val="0000FF"/>
+        </w:rPr>
+        <w:t xml:space="preserve">M6 -9, Bcl: see edits to manuscript and update current version. They are 1) I added tons of dynamics; M9 I added triplet rest before fermata  and beat 1 </w:t>
+      </w:r>
+      <w:proofErr w:type="gramStart"/>
+      <w:r>
+        <w:rPr>
+          <w:color w:val="0000FF"/>
+        </w:rPr>
+        <w:t>dynamics</w:t>
+      </w:r>
+      <w:proofErr w:type="gramEnd"/>
+      <w:r>
+        <w:rPr>
+          <w:color w:val="0000FF"/>
+        </w:rPr>
+        <w:t>.</w:t>
+      </w:r>
+    </w:p>
+    <w:p>
+      <w:pPr>
+        <w:rPr>
+          <w:color w:val="0000FF"/>
+        </w:rPr>
+      </w:pPr>
+    </w:p>
+    <w:p>
+      <w:pPr>
+        <w:rPr>
+          <w:color w:val="0000FF"/>
+        </w:rPr>
+      </w:pPr>
       <w:r>
         <w:rPr>
           <w:noProof/>
+          <w:color w:val="0000FF"/>
         </w:rPr>
         <w:drawing>
           <wp:inline distT="0" distB="0" distL="0" distR="0" wp14:anchorId="3E358C17" wp14:editId="676EEEFF">
@@ -65,7 +108,7 @@
                     <pic:cNvPicPr/>
                   </pic:nvPicPr>
                   <pic:blipFill>
-                    <a:blip r:embed="rId5" cstate="print">
+                    <a:blip r:embed="rId7" cstate="print">
                       <a:extLst>
                         <a:ext uri="{28A0092B-C50C-407E-A947-70E740481C1C}">
                           <a14:useLocalDpi xmlns:a14="http://schemas.microsoft.com/office/drawing/2010/main" val="0"/>
@@ -92,8 +135,20 @@
         </w:drawing>
       </w:r>
     </w:p>
-    <w:p/>
-    <w:p/>
+    <w:p>
+      <w:pPr>
+        <w:rPr>
+          <w:color w:val="0000FF"/>
+        </w:rPr>
+      </w:pPr>
+    </w:p>
+    <w:p>
+      <w:pPr>
+        <w:rPr>
+          <w:color w:val="0000FF"/>
+        </w:rPr>
+      </w:pPr>
+    </w:p>
     <w:p>
       <w:pPr>
         <w:pStyle w:val="ListParagraph"/>
@@ -101,35 +156,36 @@
           <w:ilvl w:val="0"/>
           <w:numId w:val="2"/>
         </w:numPr>
-      </w:pPr>
-      <w:r>
+        <w:rPr>
+          <w:color w:val="0000FF"/>
+        </w:rPr>
+      </w:pPr>
+      <w:r>
+        <w:rPr>
+          <w:color w:val="0000FF"/>
+        </w:rPr>
         <w:t xml:space="preserve">M11, add “ </w:t>
       </w:r>
       <w:r>
         <w:rPr>
           <w:b/>
           <w:bCs/>
+          <w:color w:val="0000FF"/>
           <w:sz w:val="28"/>
           <w:szCs w:val="28"/>
         </w:rPr>
-        <w:t>4’</w:t>
-      </w:r>
-      <w:r>
-        <w:rPr>
-          <w:b/>
-          <w:bCs/>
-          <w:sz w:val="28"/>
-          <w:szCs w:val="28"/>
-        </w:rPr>
-        <w:t xml:space="preserve"> </w:t>
-      </w:r>
-      <w:r>
-        <w:t>”</w:t>
-      </w:r>
-      <w:r>
-        <w:t xml:space="preserve"> next to fermata in the end of the bar (score and parts)</w:t>
-      </w:r>
-      <w:r>
+        <w:t xml:space="preserve">4’ </w:t>
+      </w:r>
+      <w:r>
+        <w:rPr>
+          <w:color w:val="0000FF"/>
+        </w:rPr>
+        <w:t>” next to fermata in the end of the bar (score and parts)</w:t>
+      </w:r>
+      <w:r>
+        <w:rPr>
+          <w:color w:val="0000FF"/>
+        </w:rPr>
         <w:br/>
       </w:r>
     </w:p>
@@ -140,11 +196,20 @@
           <w:ilvl w:val="0"/>
           <w:numId w:val="2"/>
         </w:numPr>
-      </w:pPr>
-      <w:r>
+        <w:rPr>
+          <w:color w:val="0000FF"/>
+        </w:rPr>
+      </w:pPr>
+      <w:r>
+        <w:rPr>
+          <w:color w:val="0000FF"/>
+        </w:rPr>
         <w:t>M12, change tempo to quarter = 52</w:t>
       </w:r>
       <w:r>
+        <w:rPr>
+          <w:color w:val="0000FF"/>
+        </w:rPr>
         <w:br/>
       </w:r>
     </w:p>
@@ -155,28 +220,33 @@
           <w:ilvl w:val="0"/>
           <w:numId w:val="2"/>
         </w:numPr>
-      </w:pPr>
-      <w:r>
+        <w:rPr>
+          <w:color w:val="0000FF"/>
+        </w:rPr>
+      </w:pPr>
+      <w:r>
+        <w:rPr>
+          <w:color w:val="0000FF"/>
+        </w:rPr>
         <w:t>M15, voice: beat 1 add diminuendo between 1</w:t>
       </w:r>
       <w:r>
         <w:rPr>
+          <w:color w:val="0000FF"/>
           <w:vertAlign w:val="superscript"/>
         </w:rPr>
         <w:t>st</w:t>
       </w:r>
       <w:r>
-        <w:t xml:space="preserve"> and second notes, to pp; then back to </w:t>
-      </w:r>
-      <w:proofErr w:type="spellStart"/>
-      <w:r>
-        <w:t>mp</w:t>
-      </w:r>
-      <w:proofErr w:type="spellEnd"/>
-      <w:r>
-        <w:t xml:space="preserve"> on beat 4</w:t>
-      </w:r>
-      <w:r>
+        <w:rPr>
+          <w:color w:val="0000FF"/>
+        </w:rPr>
+        <w:t xml:space="preserve"> and second notes, to pp; then back to mp on beat 4</w:t>
+      </w:r>
+      <w:r>
+        <w:rPr>
+          <w:color w:val="0000FF"/>
+        </w:rPr>
         <w:br/>
       </w:r>
     </w:p>
@@ -187,94 +257,67 @@
           <w:ilvl w:val="0"/>
           <w:numId w:val="2"/>
         </w:numPr>
-      </w:pPr>
-      <w:r>
-        <w:lastRenderedPageBreak/>
-        <w:t xml:space="preserve">M17, voice: add diminuendo </w:t>
-      </w:r>
-      <w:proofErr w:type="spellStart"/>
-      <w:r>
-        <w:t xml:space="preserve">to </w:t>
-      </w:r>
-      <w:r>
+        <w:rPr>
+          <w:color w:val="0000FF"/>
+        </w:rPr>
+      </w:pPr>
+      <w:r>
+        <w:rPr>
+          <w:color w:val="0000FF"/>
+        </w:rPr>
+        <w:t xml:space="preserve">M17, voice: add diminuendo to </w:t>
+      </w:r>
+      <w:r>
+        <w:rPr>
+          <w:color w:val="0000FF"/>
+        </w:rPr>
         <w:t>p</w:t>
       </w:r>
-      <w:proofErr w:type="spellEnd"/>
-      <w:r>
+      <w:r>
+        <w:rPr>
+          <w:color w:val="0000FF"/>
+        </w:rPr>
         <w:t xml:space="preserve"> from first to 2</w:t>
       </w:r>
       <w:r>
         <w:rPr>
+          <w:color w:val="0000FF"/>
           <w:vertAlign w:val="superscript"/>
         </w:rPr>
         <w:t>nd</w:t>
       </w:r>
       <w:r>
+        <w:rPr>
+          <w:color w:val="0000FF"/>
+        </w:rPr>
         <w:t xml:space="preserve"> note, </w:t>
       </w:r>
       <w:r>
-        <w:t xml:space="preserve">(mf&gt;p), then leave p&lt;f in the second half of the measure; for </w:t>
-      </w:r>
-      <w:proofErr w:type="spellStart"/>
-      <w:r>
-        <w:t>Bcl</w:t>
-      </w:r>
-      <w:proofErr w:type="spellEnd"/>
-      <w:r>
-        <w:t>, add</w:t>
-      </w:r>
-      <w:r>
-        <w:t xml:space="preserve"> </w:t>
-      </w:r>
-      <w:r>
-        <w:t xml:space="preserve">diminuendo </w:t>
-      </w:r>
-      <w:proofErr w:type="spellStart"/>
-      <w:r>
-        <w:t>to p</w:t>
-      </w:r>
-      <w:proofErr w:type="spellEnd"/>
-      <w:r>
-        <w:t xml:space="preserve"> from first</w:t>
-      </w:r>
-      <w:r>
-        <w:t xml:space="preserve"> </w:t>
-      </w:r>
-      <w:proofErr w:type="spellStart"/>
-      <w:r>
-        <w:t>quartermjote</w:t>
-      </w:r>
-      <w:proofErr w:type="spellEnd"/>
-      <w:r>
-        <w:t xml:space="preserve"> </w:t>
-      </w:r>
-      <w:r>
-        <w:t xml:space="preserve"> to 2</w:t>
-      </w:r>
-      <w:r>
-        <w:rPr>
+        <w:rPr>
+          <w:color w:val="0000FF"/>
+        </w:rPr>
+        <w:t>(mf&gt;p), then leave p&lt;f in the second half of the measure; for Bcl, add diminuendo to p from first quartermjote  to 2</w:t>
+      </w:r>
+      <w:r>
+        <w:rPr>
+          <w:color w:val="0000FF"/>
           <w:vertAlign w:val="superscript"/>
         </w:rPr>
         <w:t>nd</w:t>
       </w:r>
       <w:r>
-        <w:t xml:space="preserve"> </w:t>
-      </w:r>
-      <w:r>
-        <w:t xml:space="preserve">then add (p) and </w:t>
-      </w:r>
-      <w:proofErr w:type="spellStart"/>
-      <w:r>
-        <w:t>cresc</w:t>
-      </w:r>
-      <w:proofErr w:type="spellEnd"/>
-      <w:r>
-        <w:t xml:space="preserve"> to mf on first beat of M18.</w:t>
-      </w:r>
-    </w:p>
-    <w:p>
-      <w:pPr>
-        <w:pStyle w:val="ListParagraph"/>
+        <w:rPr>
+          <w:color w:val="0000FF"/>
+        </w:rPr>
+        <w:t xml:space="preserve"> then add (p) and cresc to mf on first beat of M18.</w:t>
+      </w:r>
+    </w:p>
+    <w:p>
+      <w:pPr>
+        <w:pStyle w:val="ListParagraph"/>
+        <w:rPr>
+          <w:color w:val="0000FF"/>
+        </w:rPr>
       </w:pPr>
     </w:p>
     <w:p>
@@ -284,19 +327,33 @@
           <w:ilvl w:val="0"/>
           <w:numId w:val="2"/>
         </w:numPr>
-      </w:pPr>
-      <w:r>
+        <w:rPr>
+          <w:color w:val="0000FF"/>
+        </w:rPr>
+      </w:pPr>
+      <w:r>
+        <w:rPr>
+          <w:color w:val="0000FF"/>
+        </w:rPr>
+        <w:lastRenderedPageBreak/>
         <w:t>M20, voice: change the rhythm of text and actual rhythm according to picture below:</w:t>
       </w:r>
       <w:r>
+        <w:rPr>
+          <w:color w:val="0000FF"/>
+        </w:rPr>
         <w:br/>
       </w:r>
       <w:r>
+        <w:rPr>
+          <w:color w:val="0000FF"/>
+        </w:rPr>
         <w:br/>
       </w:r>
       <w:r>
         <w:rPr>
           <w:noProof/>
+          <w:color w:val="0000FF"/>
         </w:rPr>
         <w:drawing>
           <wp:inline distT="0" distB="0" distL="0" distR="0" wp14:anchorId="465F4256" wp14:editId="6F8C9DFA">
@@ -314,7 +371,7 @@
                     <pic:cNvPicPr/>
                   </pic:nvPicPr>
                   <pic:blipFill>
-                    <a:blip r:embed="rId6" cstate="print">
+                    <a:blip r:embed="rId8" cstate="print">
                       <a:extLst>
                         <a:ext uri="{28A0092B-C50C-407E-A947-70E740481C1C}">
                           <a14:useLocalDpi xmlns:a14="http://schemas.microsoft.com/office/drawing/2010/main" val="0"/>
@@ -344,6 +401,9 @@
     <w:p>
       <w:pPr>
         <w:pStyle w:val="ListParagraph"/>
+        <w:rPr>
+          <w:color w:val="0000FF"/>
+        </w:rPr>
       </w:pPr>
     </w:p>
     <w:p>
@@ -353,14 +413,23 @@
           <w:ilvl w:val="0"/>
           <w:numId w:val="2"/>
         </w:numPr>
-      </w:pPr>
-      <w:r>
+        <w:rPr>
+          <w:color w:val="0000FF"/>
+        </w:rPr>
+      </w:pPr>
+      <w:r>
+        <w:rPr>
+          <w:color w:val="0000FF"/>
+        </w:rPr>
         <w:t>M60, voice, beat 3: connect first and second G# with a tie</w:t>
       </w:r>
     </w:p>
     <w:p>
       <w:pPr>
         <w:pStyle w:val="ListParagraph"/>
+        <w:rPr>
+          <w:color w:val="0000FF"/>
+        </w:rPr>
       </w:pPr>
     </w:p>
     <w:p>
@@ -370,14 +439,23 @@
           <w:ilvl w:val="0"/>
           <w:numId w:val="2"/>
         </w:numPr>
-      </w:pPr>
-      <w:r>
+        <w:rPr>
+          <w:color w:val="0000FF"/>
+        </w:rPr>
+      </w:pPr>
+      <w:r>
+        <w:rPr>
+          <w:color w:val="0000FF"/>
+        </w:rPr>
         <w:t>M67, voice: add another quarter note F on beat 3 and a quarter rest on beat 4, then add “(mf) on beat 2 and diminuendo to pp right before beat 4.</w:t>
       </w:r>
     </w:p>
     <w:p>
       <w:pPr>
         <w:pStyle w:val="ListParagraph"/>
+        <w:rPr>
+          <w:color w:val="0000FF"/>
+        </w:rPr>
       </w:pPr>
     </w:p>
     <w:p>
@@ -387,14 +465,23 @@
           <w:ilvl w:val="0"/>
           <w:numId w:val="2"/>
         </w:numPr>
-      </w:pPr>
-      <w:r>
+        <w:rPr>
+          <w:color w:val="0000FF"/>
+        </w:rPr>
+      </w:pPr>
+      <w:r>
+        <w:rPr>
+          <w:color w:val="0000FF"/>
+        </w:rPr>
         <w:t>M68, voice: add mf-f (shape freely)</w:t>
       </w:r>
     </w:p>
     <w:p>
       <w:pPr>
         <w:pStyle w:val="ListParagraph"/>
+        <w:rPr>
+          <w:color w:val="0000FF"/>
+        </w:rPr>
       </w:pPr>
     </w:p>
     <w:p>
@@ -404,22 +491,23 @@
           <w:ilvl w:val="0"/>
           <w:numId w:val="2"/>
         </w:numPr>
-      </w:pPr>
-      <w:r>
-        <w:t>M73, voice: move text “</w:t>
-      </w:r>
-      <w:proofErr w:type="spellStart"/>
-      <w:r>
-        <w:t>i</w:t>
-      </w:r>
-      <w:proofErr w:type="spellEnd"/>
-      <w:r>
-        <w:t>-“ to F attack on beat 3, and move slur to start from same note as new text placement</w:t>
-      </w:r>
-    </w:p>
-    <w:p>
-      <w:pPr>
-        <w:pStyle w:val="ListParagraph"/>
+        <w:rPr>
+          <w:color w:val="0000FF"/>
+        </w:rPr>
+      </w:pPr>
+      <w:r>
+        <w:rPr>
+          <w:color w:val="0000FF"/>
+        </w:rPr>
+        <w:t>M73, voice: move text “i-“ to F attack on beat 3, and move slur to start from same note as new text placement</w:t>
+      </w:r>
+    </w:p>
+    <w:p>
+      <w:pPr>
+        <w:pStyle w:val="ListParagraph"/>
+        <w:rPr>
+          <w:color w:val="0000FF"/>
+        </w:rPr>
       </w:pPr>
     </w:p>
     <w:p>
@@ -429,45 +517,29 @@
           <w:ilvl w:val="0"/>
           <w:numId w:val="2"/>
         </w:numPr>
-      </w:pPr>
-      <w:r>
+        <w:rPr>
+          <w:color w:val="0000FF"/>
+        </w:rPr>
+      </w:pPr>
+      <w:r>
+        <w:rPr>
+          <w:color w:val="0000FF"/>
+        </w:rPr>
         <w:t xml:space="preserve">M75, voice: </w:t>
       </w:r>
       <w:r>
-        <w:t>add “(mf) of beat 2</w:t>
-      </w:r>
-      <w:r>
-        <w:t xml:space="preserve"> </w:t>
-      </w:r>
-      <w:r>
-        <w:t xml:space="preserve">and diminuendo to </w:t>
-      </w:r>
-      <w:proofErr w:type="spellStart"/>
-      <w:r>
-        <w:t>pp</w:t>
-      </w:r>
-      <w:r>
-        <w:t>p</w:t>
-      </w:r>
-      <w:proofErr w:type="spellEnd"/>
-      <w:r>
-        <w:t xml:space="preserve"> right before beat 4.</w:t>
-      </w:r>
-      <w:r>
-        <w:t xml:space="preserve"> Them replace M76 downbeat with “(</w:t>
-      </w:r>
-      <w:proofErr w:type="spellStart"/>
-      <w:r>
-        <w:t>ppp</w:t>
-      </w:r>
-      <w:proofErr w:type="spellEnd"/>
-      <w:r>
-        <w:t>)”</w:t>
-      </w:r>
-    </w:p>
-    <w:p>
-      <w:pPr>
-        <w:pStyle w:val="ListParagraph"/>
+        <w:rPr>
+          <w:color w:val="0000FF"/>
+        </w:rPr>
+        <w:t>add “(mf) of beat 2 and diminuendo to ppp right before beat 4. Them replace M76 downbeat with “(ppp)”</w:t>
+      </w:r>
+    </w:p>
+    <w:p>
+      <w:pPr>
+        <w:pStyle w:val="ListParagraph"/>
+        <w:rPr>
+          <w:color w:val="0000FF"/>
+        </w:rPr>
       </w:pPr>
     </w:p>
     <w:p>
@@ -477,25 +549,29 @@
           <w:ilvl w:val="0"/>
           <w:numId w:val="2"/>
         </w:numPr>
-      </w:pPr>
-      <w:r>
-        <w:t xml:space="preserve">M112, voice: add “(mf)” on beat 1 and diminuendo to </w:t>
-      </w:r>
-      <w:proofErr w:type="spellStart"/>
-      <w:r>
-        <w:t>ppp</w:t>
-      </w:r>
-      <w:proofErr w:type="spellEnd"/>
-      <w:r>
-        <w:t xml:space="preserve"> right before beat 4.</w:t>
-      </w:r>
-      <w:r>
+        <w:rPr>
+          <w:color w:val="0000FF"/>
+        </w:rPr>
+      </w:pPr>
+      <w:r>
+        <w:rPr>
+          <w:color w:val="0000FF"/>
+        </w:rPr>
+        <w:t>M112, voice: add “(mf)” on beat 1 and diminuendo to ppp right before beat 4.</w:t>
+      </w:r>
+      <w:r>
+        <w:rPr>
+          <w:color w:val="0000FF"/>
+        </w:rPr>
         <w:t xml:space="preserve"> Then add “f” on beat 1of M113</w:t>
       </w:r>
     </w:p>
     <w:p>
       <w:pPr>
         <w:pStyle w:val="ListParagraph"/>
+        <w:rPr>
+          <w:color w:val="0000FF"/>
+        </w:rPr>
       </w:pPr>
     </w:p>
     <w:p>
@@ -505,24 +581,38 @@
           <w:ilvl w:val="0"/>
           <w:numId w:val="2"/>
         </w:numPr>
-      </w:pPr>
-      <w:r>
+        <w:rPr>
+          <w:color w:val="0000FF"/>
+        </w:rPr>
+      </w:pPr>
+      <w:r>
+        <w:rPr>
+          <w:color w:val="0000FF"/>
+        </w:rPr>
         <w:t xml:space="preserve">M113, voice: </w:t>
       </w:r>
       <w:r>
+        <w:rPr>
+          <w:color w:val="0000FF"/>
+        </w:rPr>
         <w:t>beat 3, make quintuplet 8</w:t>
       </w:r>
       <w:r>
         <w:rPr>
+          <w:color w:val="0000FF"/>
           <w:vertAlign w:val="superscript"/>
         </w:rPr>
         <w:t>th</w:t>
       </w:r>
       <w:r>
+        <w:rPr>
+          <w:color w:val="0000FF"/>
+        </w:rPr>
         <w:t xml:space="preserve"> rest into B tied from note before, so that there are no rests before last quintuplet 16</w:t>
       </w:r>
       <w:r>
         <w:rPr>
+          <w:color w:val="0000FF"/>
           <w:vertAlign w:val="superscript"/>
         </w:rPr>
         <w:t>th</w:t>
@@ -531,6 +621,9 @@
     <w:p>
       <w:pPr>
         <w:pStyle w:val="ListParagraph"/>
+        <w:rPr>
+          <w:color w:val="0000FF"/>
+        </w:rPr>
       </w:pPr>
     </w:p>
     <w:p>
@@ -540,14 +633,23 @@
           <w:ilvl w:val="0"/>
           <w:numId w:val="2"/>
         </w:numPr>
-      </w:pPr>
-      <w:r>
+        <w:rPr>
+          <w:color w:val="0000FF"/>
+        </w:rPr>
+      </w:pPr>
+      <w:r>
+        <w:rPr>
+          <w:color w:val="0000FF"/>
+        </w:rPr>
         <w:t>M127, voice: beat 3, add “(mf)”</w:t>
       </w:r>
     </w:p>
     <w:p>
       <w:pPr>
         <w:pStyle w:val="ListParagraph"/>
+        <w:rPr>
+          <w:color w:val="0000FF"/>
+        </w:rPr>
       </w:pPr>
     </w:p>
     <w:p>
@@ -557,26 +659,29 @@
           <w:ilvl w:val="0"/>
           <w:numId w:val="2"/>
         </w:numPr>
-      </w:pPr>
-      <w:r>
-        <w:lastRenderedPageBreak/>
-        <w:t xml:space="preserve">M128, voice: add “mf &gt; </w:t>
-      </w:r>
-      <w:proofErr w:type="spellStart"/>
-      <w:r>
-        <w:t>ppp</w:t>
-      </w:r>
-      <w:proofErr w:type="spellEnd"/>
-      <w:r>
-        <w:t>” from beat 2 to before beat 4</w:t>
-      </w:r>
-      <w:r>
+        <w:rPr>
+          <w:color w:val="0000FF"/>
+        </w:rPr>
+      </w:pPr>
+      <w:r>
+        <w:rPr>
+          <w:color w:val="0000FF"/>
+        </w:rPr>
+        <w:t>M128, voice: add “mf &gt; ppp” from beat 2 to before beat 4</w:t>
+      </w:r>
+      <w:r>
+        <w:rPr>
+          <w:color w:val="0000FF"/>
+        </w:rPr>
         <w:t xml:space="preserve"> Then add “mf” on M129 first note</w:t>
       </w:r>
     </w:p>
     <w:p>
       <w:pPr>
         <w:pStyle w:val="ListParagraph"/>
+        <w:rPr>
+          <w:color w:val="0000FF"/>
+        </w:rPr>
       </w:pPr>
     </w:p>
     <w:p>
@@ -586,22 +691,23 @@
           <w:ilvl w:val="0"/>
           <w:numId w:val="2"/>
         </w:numPr>
-      </w:pPr>
-      <w:r>
-        <w:t xml:space="preserve">M130, voice: add “(mf) &gt; </w:t>
-      </w:r>
-      <w:proofErr w:type="spellStart"/>
-      <w:r>
-        <w:t>ppp</w:t>
-      </w:r>
-      <w:proofErr w:type="spellEnd"/>
-      <w:r>
-        <w:t>” from beat 2 to end of bar</w:t>
-      </w:r>
-    </w:p>
-    <w:p>
-      <w:pPr>
-        <w:pStyle w:val="ListParagraph"/>
+        <w:rPr>
+          <w:color w:val="0000FF"/>
+        </w:rPr>
+      </w:pPr>
+      <w:r>
+        <w:rPr>
+          <w:color w:val="0000FF"/>
+        </w:rPr>
+        <w:t>M130, voice: add “(mf) &gt; ppp” from beat 2 to end of bar</w:t>
+      </w:r>
+    </w:p>
+    <w:p>
+      <w:pPr>
+        <w:pStyle w:val="ListParagraph"/>
+        <w:rPr>
+          <w:color w:val="0000FF"/>
+        </w:rPr>
       </w:pPr>
     </w:p>
     <w:p>
@@ -611,6 +717,9 @@
           <w:ilvl w:val="0"/>
           <w:numId w:val="2"/>
         </w:numPr>
+        <w:rPr>
+          <w:color w:val="0000FF"/>
+        </w:rPr>
       </w:pPr>
     </w:p>
     <w:sectPr>
@@ -621,6 +730,44 @@
     </w:sectPr>
   </w:body>
 </w:document>
+</file>
+
+<file path=word/endnotes.xml><?xml version="1.0" encoding="utf-8"?>
+<w:endnotes xmlns:wpc="http://schemas.microsoft.com/office/word/2010/wordprocessingCanvas" xmlns:cx="http://schemas.microsoft.com/office/drawing/2014/chartex" xmlns:cx1="http://schemas.microsoft.com/office/drawing/2015/9/8/chartex" xmlns:cx2="http://schemas.microsoft.com/office/drawing/2015/10/21/chartex" xmlns:cx3="http://schemas.microsoft.com/office/drawing/2016/5/9/chartex" xmlns:cx4="http://schemas.microsoft.com/office/drawing/2016/5/10/chartex" xmlns:cx5="http://schemas.microsoft.com/office/drawing/2016/5/11/chartex" xmlns:cx6="http://schemas.microsoft.com/office/drawing/2016/5/12/chartex" xmlns:cx7="http://schemas.microsoft.com/office/drawing/2016/5/13/chartex" xmlns:cx8="http://schemas.microsoft.com/office/drawing/2016/5/14/chartex" xmlns:mc="http://schemas.openxmlformats.org/markup-compatibility/2006" xmlns:aink="http://schemas.microsoft.com/office/drawing/2016/ink" xmlns:am3d="http://schemas.microsoft.com/office/drawing/2017/model3d" xmlns:o="urn:schemas-microsoft-com:office:office" xmlns:oel="http://schemas.microsoft.com/office/2019/extlst" xmlns:r="http://schemas.openxmlformats.org/officeDocument/2006/relationships" xmlns:m="http://schemas.openxmlformats.org/officeDocument/2006/math" xmlns:v="urn:schemas-microsoft-com:vml" xmlns:wp14="http://schemas.microsoft.com/office/word/2010/wordprocessingDrawing" xmlns:wp="http://schemas.openxmlformats.org/drawingml/2006/wordprocessingDrawing" xmlns:w10="urn:schemas-microsoft-com:office:word" xmlns:w="http://schemas.openxmlformats.org/wordprocessingml/2006/main" xmlns:w14="http://schemas.microsoft.com/office/word/2010/wordml" xmlns:w15="http://schemas.microsoft.com/office/word/2012/wordml" xmlns:w16cex="http://schemas.microsoft.com/office/word/2018/wordml/cex" xmlns:w16cid="http://schemas.microsoft.com/office/word/2016/wordml/cid" xmlns:w16="http://schemas.microsoft.com/office/word/2018/wordml" xmlns:w16du="http://schemas.microsoft.com/office/word/2023/wordml/word16du" xmlns:w16sdtdh="http://schemas.microsoft.com/office/word/2020/wordml/sdtdatahash" xmlns:w16se="http://schemas.microsoft.com/office/word/2015/wordml/symex" xmlns:wpg="http://schemas.microsoft.com/office/word/2010/wordprocessingGroup" xmlns:wpi="http://schemas.microsoft.com/office/word/2010/wordprocessingInk" xmlns:wne="http://schemas.microsoft.com/office/word/2006/wordml" xmlns:wps="http://schemas.microsoft.com/office/word/2010/wordprocessingShape" mc:Ignorable="w14 w15 w16se w16cid w16 w16cex w16sdtdh w16du wp14">
+  <w:endnote w:type="separator" w:id="-1">
+    <w:p>
+      <w:r>
+        <w:separator/>
+      </w:r>
+    </w:p>
+  </w:endnote>
+  <w:endnote w:type="continuationSeparator" w:id="0">
+    <w:p>
+      <w:r>
+        <w:continuationSeparator/>
+      </w:r>
+    </w:p>
+  </w:endnote>
+</w:endnotes>
+</file>
+
+<file path=word/footnotes.xml><?xml version="1.0" encoding="utf-8"?>
+<w:footnotes xmlns:wpc="http://schemas.microsoft.com/office/word/2010/wordprocessingCanvas" xmlns:cx="http://schemas.microsoft.com/office/drawing/2014/chartex" xmlns:cx1="http://schemas.microsoft.com/office/drawing/2015/9/8/chartex" xmlns:cx2="http://schemas.microsoft.com/office/drawing/2015/10/21/chartex" xmlns:cx3="http://schemas.microsoft.com/office/drawing/2016/5/9/chartex" xmlns:cx4="http://schemas.microsoft.com/office/drawing/2016/5/10/chartex" xmlns:cx5="http://schemas.microsoft.com/office/drawing/2016/5/11/chartex" xmlns:cx6="http://schemas.microsoft.com/office/drawing/2016/5/12/chartex" xmlns:cx7="http://schemas.microsoft.com/office/drawing/2016/5/13/chartex" xmlns:cx8="http://schemas.microsoft.com/office/drawing/2016/5/14/chartex" xmlns:mc="http://schemas.openxmlformats.org/markup-compatibility/2006" xmlns:aink="http://schemas.microsoft.com/office/drawing/2016/ink" xmlns:am3d="http://schemas.microsoft.com/office/drawing/2017/model3d" xmlns:o="urn:schemas-microsoft-com:office:office" xmlns:oel="http://schemas.microsoft.com/office/2019/extlst" xmlns:r="http://schemas.openxmlformats.org/officeDocument/2006/relationships" xmlns:m="http://schemas.openxmlformats.org/officeDocument/2006/math" xmlns:v="urn:schemas-microsoft-com:vml" xmlns:wp14="http://schemas.microsoft.com/office/word/2010/wordprocessingDrawing" xmlns:wp="http://schemas.openxmlformats.org/drawingml/2006/wordprocessingDrawing" xmlns:w10="urn:schemas-microsoft-com:office:word" xmlns:w="http://schemas.openxmlformats.org/wordprocessingml/2006/main" xmlns:w14="http://schemas.microsoft.com/office/word/2010/wordml" xmlns:w15="http://schemas.microsoft.com/office/word/2012/wordml" xmlns:w16cex="http://schemas.microsoft.com/office/word/2018/wordml/cex" xmlns:w16cid="http://schemas.microsoft.com/office/word/2016/wordml/cid" xmlns:w16="http://schemas.microsoft.com/office/word/2018/wordml" xmlns:w16du="http://schemas.microsoft.com/office/word/2023/wordml/word16du" xmlns:w16sdtdh="http://schemas.microsoft.com/office/word/2020/wordml/sdtdatahash" xmlns:w16se="http://schemas.microsoft.com/office/word/2015/wordml/symex" xmlns:wpg="http://schemas.microsoft.com/office/word/2010/wordprocessingGroup" xmlns:wpi="http://schemas.microsoft.com/office/word/2010/wordprocessingInk" xmlns:wne="http://schemas.microsoft.com/office/word/2006/wordml" xmlns:wps="http://schemas.microsoft.com/office/word/2010/wordprocessingShape" mc:Ignorable="w14 w15 w16se w16cid w16 w16cex w16sdtdh w16du wp14">
+  <w:footnote w:type="separator" w:id="-1">
+    <w:p>
+      <w:r>
+        <w:separator/>
+      </w:r>
+    </w:p>
+  </w:footnote>
+  <w:footnote w:type="continuationSeparator" w:id="0">
+    <w:p>
+      <w:r>
+        <w:continuationSeparator/>
+      </w:r>
+    </w:p>
+  </w:footnote>
+</w:footnotes>
 </file>
 
 <file path=word/numbering.xml><?xml version="1.0" encoding="utf-8"?>
@@ -2236,6 +2383,48 @@
       <w:spacing w:val="5"/>
     </w:rPr>
   </w:style>
+  <w:style w:type="paragraph" w:styleId="Header">
+    <w:name w:val="header"/>
+    <w:basedOn w:val="Normal"/>
+    <w:link w:val="HeaderChar"/>
+    <w:uiPriority w:val="99"/>
+    <w:unhideWhenUsed/>
+    <w:rsid w:val="00A815DB"/>
+    <w:pPr>
+      <w:tabs>
+        <w:tab w:val="center" w:pos="4513"/>
+        <w:tab w:val="right" w:pos="9026"/>
+      </w:tabs>
+    </w:pPr>
+  </w:style>
+  <w:style w:type="character" w:customStyle="1" w:styleId="HeaderChar">
+    <w:name w:val="Header Char"/>
+    <w:basedOn w:val="DefaultParagraphFont"/>
+    <w:link w:val="Header"/>
+    <w:uiPriority w:val="99"/>
+    <w:rsid w:val="00A815DB"/>
+  </w:style>
+  <w:style w:type="paragraph" w:styleId="Footer">
+    <w:name w:val="footer"/>
+    <w:basedOn w:val="Normal"/>
+    <w:link w:val="FooterChar"/>
+    <w:uiPriority w:val="99"/>
+    <w:unhideWhenUsed/>
+    <w:rsid w:val="00A815DB"/>
+    <w:pPr>
+      <w:tabs>
+        <w:tab w:val="center" w:pos="4513"/>
+        <w:tab w:val="right" w:pos="9026"/>
+      </w:tabs>
+    </w:pPr>
+  </w:style>
+  <w:style w:type="character" w:customStyle="1" w:styleId="FooterChar">
+    <w:name w:val="Footer Char"/>
+    <w:basedOn w:val="DefaultParagraphFont"/>
+    <w:link w:val="Footer"/>
+    <w:uiPriority w:val="99"/>
+    <w:rsid w:val="00A815DB"/>
+  </w:style>
 </w:styles>
 </file>
 

</xml_diff>